<commit_message>
added styling and reformated the content
</commit_message>
<xml_diff>
--- a/out/test_template_output.docx
+++ b/out/test_template_output.docx
@@ -114,6 +114,7 @@
     <w:p>
       <w:pPr>
         <w:spacing w:after="160" w:line="259" w:lineRule="auto"/>
+        <w:jc w:val="center"/>
         <w:rPr>
           <w:rFonts w:ascii="Menlo" w:hAnsi="Menlo" w:cs="Menlo"/>
           <w:color w:val="D8DEE9"/>
@@ -121,15 +122,6 @@
           <w:szCs w:val="18"/>
         </w:rPr>
       </w:pPr>
-    </w:p>
-    <w:p>
-      <w:pPr>
-        <w:spacing w:after="160" w:line="259" w:lineRule="auto"/>
-        <w:jc w:val="center"/>
-        <w:rPr>
-          <w:lang w:val="en-US"/>
-        </w:rPr>
-      </w:pPr>
       <w:r>
         <w:rPr>
           <w:rFonts w:ascii="Times New Roman" w:hAnsi="Times New Roman"/>
@@ -148,13 +140,12 @@
           <w:rFonts w:ascii="Times New Roman" w:hAnsi="Times New Roman"/>
           <w:sz w:val="28"/>
         </w:rPr>
-        <w:t>Prepared on July 13, 2025 at 02:13 PM</w:t>
+        <w:t>Prepared on July 13, 2025 at 05:18 PM</w:t>
       </w:r>
     </w:p>
     <w:p>
       <w:pPr>
         <w:spacing w:after="160" w:line="259" w:lineRule="auto"/>
-        <w:jc w:val="center"/>
         <w:rPr>
           <w:rFonts w:ascii="Menlo" w:hAnsi="Menlo" w:cs="Menlo"/>
           <w:color w:val="D8DEE9"/>
@@ -166,7 +157,6 @@
     <w:p>
       <w:pPr>
         <w:spacing w:after="160" w:line="259" w:lineRule="auto"/>
-        <w:jc w:val="center"/>
         <w:rPr>
           <w:rFonts w:ascii="Menlo" w:hAnsi="Menlo" w:cs="Menlo"/>
           <w:color w:val="D8DEE9"/>
@@ -178,7 +168,6 @@
     <w:p>
       <w:pPr>
         <w:spacing w:after="160" w:line="259" w:lineRule="auto"/>
-        <w:jc w:val="center"/>
         <w:rPr>
           <w:rFonts w:ascii="Menlo" w:hAnsi="Menlo" w:cs="Menlo"/>
           <w:color w:val="D8DEE9"/>
@@ -190,7 +179,6 @@
     <w:p>
       <w:pPr>
         <w:spacing w:after="160" w:line="259" w:lineRule="auto"/>
-        <w:jc w:val="center"/>
         <w:rPr>
           <w:rFonts w:ascii="Menlo" w:hAnsi="Menlo" w:cs="Menlo"/>
           <w:color w:val="D8DEE9"/>
@@ -202,7 +190,6 @@
     <w:p>
       <w:pPr>
         <w:spacing w:after="160" w:line="259" w:lineRule="auto"/>
-        <w:jc w:val="center"/>
         <w:rPr>
           <w:rFonts w:ascii="Menlo" w:hAnsi="Menlo" w:cs="Menlo"/>
           <w:color w:val="D8DEE9"/>
@@ -214,7 +201,6 @@
     <w:p>
       <w:pPr>
         <w:spacing w:after="160" w:line="259" w:lineRule="auto"/>
-        <w:jc w:val="center"/>
         <w:rPr>
           <w:rFonts w:ascii="Menlo" w:hAnsi="Menlo" w:cs="Menlo"/>
           <w:color w:val="D8DEE9"/>
@@ -226,7 +212,6 @@
     <w:p>
       <w:pPr>
         <w:spacing w:after="160" w:line="259" w:lineRule="auto"/>
-        <w:jc w:val="center"/>
         <w:rPr>
           <w:rFonts w:ascii="Menlo" w:hAnsi="Menlo" w:cs="Menlo"/>
           <w:color w:val="D8DEE9"/>
@@ -238,7 +223,6 @@
     <w:p>
       <w:pPr>
         <w:spacing w:after="160" w:line="259" w:lineRule="auto"/>
-        <w:jc w:val="center"/>
         <w:rPr>
           <w:rFonts w:ascii="Menlo" w:hAnsi="Menlo" w:cs="Menlo"/>
           <w:color w:val="D8DEE9"/>
@@ -250,7 +234,6 @@
     <w:p>
       <w:pPr>
         <w:spacing w:after="160" w:line="259" w:lineRule="auto"/>
-        <w:jc w:val="center"/>
         <w:rPr>
           <w:rFonts w:ascii="Menlo" w:hAnsi="Menlo" w:cs="Menlo"/>
           <w:color w:val="D8DEE9"/>
@@ -262,7 +245,6 @@
     <w:p>
       <w:pPr>
         <w:spacing w:after="160" w:line="259" w:lineRule="auto"/>
-        <w:jc w:val="center"/>
         <w:rPr>
           <w:rFonts w:ascii="Menlo" w:hAnsi="Menlo" w:cs="Menlo"/>
           <w:color w:val="D8DEE9"/>
@@ -274,7 +256,6 @@
     <w:p>
       <w:pPr>
         <w:spacing w:after="160" w:line="259" w:lineRule="auto"/>
-        <w:jc w:val="center"/>
         <w:rPr>
           <w:rFonts w:ascii="Menlo" w:hAnsi="Menlo" w:cs="Menlo"/>
           <w:color w:val="D8DEE9"/>
@@ -286,7 +267,6 @@
     <w:p>
       <w:pPr>
         <w:spacing w:after="160" w:line="259" w:lineRule="auto"/>
-        <w:jc w:val="center"/>
         <w:rPr>
           <w:rFonts w:ascii="Menlo" w:hAnsi="Menlo" w:cs="Menlo"/>
           <w:color w:val="D8DEE9"/>
@@ -298,7 +278,6 @@
     <w:p>
       <w:pPr>
         <w:spacing w:after="160" w:line="259" w:lineRule="auto"/>
-        <w:jc w:val="center"/>
         <w:rPr>
           <w:rFonts w:ascii="Menlo" w:hAnsi="Menlo" w:cs="Menlo"/>
           <w:color w:val="D8DEE9"/>
@@ -310,46 +289,25 @@
     <w:p>
       <w:pPr>
         <w:spacing w:after="160" w:line="259" w:lineRule="auto"/>
-        <w:jc w:val="center"/>
-        <w:rPr>
-          <w:rFonts w:ascii="Menlo" w:hAnsi="Menlo" w:cs="Menlo"/>
-          <w:color w:val="D8DEE9"/>
-          <w:sz w:val="18"/>
-          <w:szCs w:val="18"/>
-        </w:rPr>
-      </w:pPr>
-    </w:p>
-    <w:p>
-      <w:pPr>
-        <w:spacing w:after="160" w:line="259" w:lineRule="auto"/>
-        <w:jc w:val="center"/>
-        <w:rPr>
-          <w:rFonts w:ascii="Menlo" w:hAnsi="Menlo" w:cs="Menlo"/>
-          <w:color w:val="D8DEE9"/>
-          <w:sz w:val="18"/>
-          <w:szCs w:val="18"/>
-        </w:rPr>
-      </w:pPr>
-    </w:p>
-    <w:p>
-      <w:pPr>
-        <w:spacing w:after="160" w:line="259" w:lineRule="auto"/>
-        <w:jc w:val="center"/>
-        <w:rPr>
-          <w:rFonts w:ascii="Menlo" w:hAnsi="Menlo" w:cs="Menlo"/>
-          <w:color w:val="D8DEE9"/>
-          <w:sz w:val="18"/>
-          <w:szCs w:val="18"/>
-        </w:rPr>
-      </w:pPr>
-    </w:p>
-    <w:p>
-      <w:pPr>
-        <w:spacing w:after="160" w:line="360" w:lineRule="auto"/>
+        <w:rPr>
+          <w:lang w:val="en-US"/>
+        </w:rPr>
+      </w:pPr>
+    </w:p>
+    <w:p>
+      <w:pPr>
+        <w:tabs>
+          <w:tab w:val="left" w:pos="3060"/>
+        </w:tabs>
+        <w:rPr>
+          <w:lang w:val="en-US"/>
+        </w:rPr>
+      </w:pPr>
+    </w:p>
+    <w:p>
+      <w:pPr>
+        <w:spacing w:line="360" w:lineRule="auto" w:before="0" w:after="0"/>
         <w:jc w:val="both"/>
-        <w:rPr>
-          <w:lang w:val="en-US"/>
-        </w:rPr>
       </w:pPr>
       <w:r>
         <w:rPr>
@@ -362,6 +320,19 @@
     </w:p>
     <w:p>
       <w:pPr>
+        <w:spacing w:line="360" w:lineRule="auto" w:before="0" w:after="0"/>
+        <w:jc w:val="both"/>
+      </w:pPr>
+      <w:r>
+        <w:rPr>
+          <w:rFonts w:ascii="Times New Roman" w:hAnsi="Times New Roman"/>
+          <w:sz w:val="24"/>
+        </w:rPr>
+        <w:t>This is a summary of the company.</w:t>
+      </w:r>
+    </w:p>
+    <w:p>
+      <w:pPr>
         <w:spacing w:line="360" w:lineRule="auto"/>
         <w:jc w:val="both"/>
       </w:pPr>
@@ -370,24 +341,16 @@
           <w:rFonts w:ascii="Times New Roman" w:hAnsi="Times New Roman"/>
           <w:sz w:val="24"/>
         </w:rPr>
-        <w:t>This is a summary of the company.</w:t>
       </w:r>
     </w:p>
     <w:p>
       <w:pPr>
-        <w:spacing w:line="360" w:lineRule="auto"/>
-        <w:jc w:val="both"/>
-      </w:pPr>
-      <w:r>
-        <w:rPr>
-          <w:rFonts w:ascii="Times New Roman" w:hAnsi="Times New Roman"/>
-          <w:sz w:val="24"/>
-        </w:rPr>
-      </w:r>
-    </w:p>
-    <w:p>
-      <w:pPr>
-        <w:spacing w:line="360" w:lineRule="auto"/>
+        <w:spacing w:after="0"/>
+      </w:pPr>
+    </w:p>
+    <w:p>
+      <w:pPr>
+        <w:spacing w:line="360" w:lineRule="auto" w:after="120"/>
         <w:jc w:val="both"/>
       </w:pPr>
       <w:r>
@@ -439,7 +402,12 @@
     </w:p>
     <w:p>
       <w:pPr>
-        <w:spacing w:line="360" w:lineRule="auto"/>
+        <w:spacing w:after="0"/>
+      </w:pPr>
+    </w:p>
+    <w:p>
+      <w:pPr>
+        <w:spacing w:line="360" w:lineRule="auto" w:after="120"/>
         <w:jc w:val="both"/>
       </w:pPr>
       <w:r>
@@ -478,7 +446,12 @@
     </w:p>
     <w:p>
       <w:pPr>
-        <w:spacing w:line="360" w:lineRule="auto"/>
+        <w:spacing w:after="0"/>
+      </w:pPr>
+    </w:p>
+    <w:p>
+      <w:pPr>
+        <w:spacing w:line="360" w:lineRule="auto" w:after="120"/>
         <w:jc w:val="both"/>
       </w:pPr>
       <w:r>
@@ -517,7 +490,12 @@
     </w:p>
     <w:p>
       <w:pPr>
-        <w:spacing w:line="360" w:lineRule="auto"/>
+        <w:spacing w:after="0"/>
+      </w:pPr>
+    </w:p>
+    <w:p>
+      <w:pPr>
+        <w:spacing w:line="360" w:lineRule="auto" w:after="120"/>
         <w:jc w:val="both"/>
       </w:pPr>
       <w:r>
@@ -556,7 +534,12 @@
     </w:p>
     <w:p>
       <w:pPr>
-        <w:spacing w:line="360" w:lineRule="auto"/>
+        <w:spacing w:after="0"/>
+      </w:pPr>
+    </w:p>
+    <w:p>
+      <w:pPr>
+        <w:spacing w:line="360" w:lineRule="auto" w:after="120"/>
         <w:jc w:val="both"/>
       </w:pPr>
       <w:r>
@@ -592,151 +575,6 @@
           <w:sz w:val="24"/>
         </w:rPr>
       </w:r>
-    </w:p>
-    <w:p>
-      <w:pPr>
-        <w:spacing w:after="160" w:line="259" w:lineRule="auto"/>
-        <w:rPr>
-          <w:lang w:val="en-US"/>
-        </w:rPr>
-      </w:pPr>
-    </w:p>
-    <w:p>
-      <w:pPr>
-        <w:spacing w:after="160" w:line="259" w:lineRule="auto"/>
-        <w:jc w:val="center"/>
-        <w:rPr>
-          <w:lang w:val="en-US"/>
-        </w:rPr>
-      </w:pPr>
-    </w:p>
-    <w:p>
-      <w:pPr>
-        <w:spacing w:after="160" w:line="259" w:lineRule="auto"/>
-        <w:jc w:val="center"/>
-        <w:rPr>
-          <w:lang w:val="en-US"/>
-        </w:rPr>
-      </w:pPr>
-    </w:p>
-    <w:p>
-      <w:pPr>
-        <w:spacing w:after="160" w:line="259" w:lineRule="auto"/>
-        <w:jc w:val="center"/>
-        <w:rPr>
-          <w:lang w:val="en-US"/>
-        </w:rPr>
-      </w:pPr>
-    </w:p>
-    <w:p>
-      <w:pPr>
-        <w:spacing w:after="160" w:line="259" w:lineRule="auto"/>
-        <w:jc w:val="center"/>
-        <w:rPr>
-          <w:lang w:val="en-US"/>
-        </w:rPr>
-      </w:pPr>
-    </w:p>
-    <w:p>
-      <w:pPr>
-        <w:spacing w:after="160" w:line="259" w:lineRule="auto"/>
-        <w:jc w:val="center"/>
-        <w:rPr>
-          <w:lang w:val="en-US"/>
-        </w:rPr>
-      </w:pPr>
-    </w:p>
-    <w:p>
-      <w:pPr>
-        <w:spacing w:after="160" w:line="259" w:lineRule="auto"/>
-        <w:jc w:val="center"/>
-        <w:rPr>
-          <w:lang w:val="en-US"/>
-        </w:rPr>
-      </w:pPr>
-    </w:p>
-    <w:p>
-      <w:pPr>
-        <w:spacing w:after="160" w:line="259" w:lineRule="auto"/>
-        <w:jc w:val="center"/>
-        <w:rPr>
-          <w:lang w:val="en-US"/>
-        </w:rPr>
-      </w:pPr>
-    </w:p>
-    <w:p>
-      <w:pPr>
-        <w:spacing w:after="160" w:line="259" w:lineRule="auto"/>
-        <w:jc w:val="center"/>
-        <w:rPr>
-          <w:lang w:val="en-US"/>
-        </w:rPr>
-      </w:pPr>
-    </w:p>
-    <w:p>
-      <w:pPr>
-        <w:spacing w:after="160" w:line="259" w:lineRule="auto"/>
-        <w:jc w:val="center"/>
-        <w:rPr>
-          <w:lang w:val="en-US"/>
-        </w:rPr>
-      </w:pPr>
-    </w:p>
-    <w:p>
-      <w:pPr>
-        <w:spacing w:after="160" w:line="259" w:lineRule="auto"/>
-        <w:jc w:val="center"/>
-        <w:rPr>
-          <w:lang w:val="en-US"/>
-        </w:rPr>
-      </w:pPr>
-    </w:p>
-    <w:p>
-      <w:pPr>
-        <w:spacing w:after="160" w:line="259" w:lineRule="auto"/>
-        <w:jc w:val="center"/>
-        <w:rPr>
-          <w:lang w:val="en-US"/>
-        </w:rPr>
-      </w:pPr>
-    </w:p>
-    <w:p>
-      <w:pPr>
-        <w:spacing w:after="160" w:line="259" w:lineRule="auto"/>
-        <w:jc w:val="center"/>
-        <w:rPr>
-          <w:lang w:val="en-US"/>
-        </w:rPr>
-      </w:pPr>
-    </w:p>
-    <w:p>
-      <w:pPr>
-        <w:spacing w:after="160" w:line="259" w:lineRule="auto"/>
-        <w:jc w:val="center"/>
-        <w:rPr>
-          <w:lang w:val="en-US"/>
-        </w:rPr>
-      </w:pPr>
-    </w:p>
-    <w:p>
-      <w:pPr>
-        <w:tabs>
-          <w:tab w:val="left" w:pos="3060"/>
-        </w:tabs>
-        <w:rPr>
-          <w:lang w:val="en-US"/>
-        </w:rPr>
-      </w:pPr>
-    </w:p>
-    <w:p>
-      <w:pPr>
-        <w:tabs>
-          <w:tab w:val="left" w:pos="3060"/>
-        </w:tabs>
-        <w:rPr>
-          <w:lang w:val="en-US"/>
-        </w:rPr>
-      </w:pPr>
     </w:p>
     <w:sectPr>
       <w:headerReference w:type="default" r:id="rId9"/>

</xml_diff>